<commit_message>
Fix MCP tools hidden by on-demand loading; cover page overflow; sparse slides
- On-demand tool loading kept user-connected MCP tools out of the model's
  tool list, so they were never offered (desktop e2e: MCP call never
  reached the confirmation step). MCP tools now stay loaded when there
  are 12 or fewer of them
- Word cover: replace empty spacer paragraphs (which inherit 1.5x line
  spacing and paragraph spacing) with fixed spacing, so the cover fits
  on one page; the sample plan drops from 7 pages to 5
- PPT: 2-4 short points become numbered cards filling the slide;
  comparison boxes size to their content; wider bullet indent; taller
  rows for short tables
- Regenerated docs/samples and the single-file build

Verified: unit 503/503, smoke 126/127 (WebGL timing check only),
standalone 14/14, desktop 33/33; samples rendered with LibreOffice.

Co-Authored-By: Claude Opus 5.5 <noreply@anthropic.com>
Claude-Session: https://claude.ai/code/session_0165YW5YZypxDZBQXrf4B3xs
</commit_message>
<xml_diff>
--- a/docs/samples/项目方案-智慧园区一期.docx
+++ b/docs/samples/项目方案-智慧园区一期.docx
@@ -2,17 +2,9 @@
 <file path=word/document.xml><?xml version="1.0" encoding="utf-8"?>
 <w:document xmlns:wpc="http://schemas.microsoft.com/office/word/2010/wordprocessingCanvas" xmlns:mc="http://schemas.openxmlformats.org/markup-compatibility/2006" xmlns:o="urn:schemas-microsoft-com:office:office" xmlns:r="http://schemas.openxmlformats.org/officeDocument/2006/relationships" xmlns:m="http://schemas.openxmlformats.org/officeDocument/2006/math" xmlns:v="urn:schemas-microsoft-com:vml" xmlns:wp14="http://schemas.microsoft.com/office/word/2010/wordprocessingDrawing" xmlns:wp="http://schemas.openxmlformats.org/drawingml/2006/wordprocessingDrawing" xmlns:w10="urn:schemas-microsoft-com:office:word" xmlns:w="http://schemas.openxmlformats.org/wordprocessingml/2006/main" xmlns:w14="http://schemas.microsoft.com/office/word/2010/wordml" xmlns:w15="http://schemas.microsoft.com/office/word/2012/wordml" xmlns:wpg="http://schemas.microsoft.com/office/word/2010/wordprocessingGroup" xmlns:wpi="http://schemas.microsoft.com/office/word/2010/wordprocessingInk" xmlns:wne="http://schemas.microsoft.com/office/word/2006/wordml" xmlns:wps="http://schemas.microsoft.com/office/word/2010/wordprocessingShape" xmlns:cx="http://schemas.microsoft.com/office/drawing/2014/chartex" xmlns:cx1="http://schemas.microsoft.com/office/drawing/2015/9/8/chartex" xmlns:cx2="http://schemas.microsoft.com/office/drawing/2015/10/21/chartex" xmlns:cx3="http://schemas.microsoft.com/office/drawing/2016/5/9/chartex" xmlns:cx4="http://schemas.microsoft.com/office/drawing/2016/5/10/chartex" xmlns:cx5="http://schemas.microsoft.com/office/drawing/2016/5/11/chartex" xmlns:cx6="http://schemas.microsoft.com/office/drawing/2016/5/12/chartex" xmlns:cx7="http://schemas.microsoft.com/office/drawing/2016/5/13/chartex" xmlns:cx8="http://schemas.microsoft.com/office/drawing/2016/5/14/chartex" xmlns:aink="http://schemas.microsoft.com/office/drawing/2016/ink" xmlns:am3d="http://schemas.microsoft.com/office/drawing/2017/model3d" xmlns:w16cex="http://schemas.microsoft.com/office/word/2018/wordml/cex" xmlns:w16cid="http://schemas.microsoft.com/office/word/2016/wordml/cid" xmlns:w16="http://schemas.microsoft.com/office/word/2018/wordml" xmlns:w16sdtdh="http://schemas.microsoft.com/office/word/2020/wordml/sdtdatahash" xmlns:w16se="http://schemas.microsoft.com/office/word/2015/wordml/symex" mc:Ignorable="w14 w15 wp14">
   <w:body>
-    <w:p/>
-    <w:p/>
-    <w:p/>
-    <w:p/>
-    <w:p/>
-    <w:p/>
-    <w:p/>
-    <w:p/>
-    <w:p>
-      <w:pPr>
-        <w:spacing w:after="360"/>
+    <w:p>
+      <w:pPr>
+        <w:spacing w:after="360" w:before="3400" w:line="360"/>
         <w:jc w:val="center"/>
       </w:pPr>
       <w:r>
@@ -51,19 +43,10 @@
         <w:jc w:val="center"/>
       </w:pPr>
     </w:p>
-    <w:p/>
-    <w:p/>
-    <w:p/>
-    <w:p/>
-    <w:p/>
-    <w:p/>
-    <w:p/>
-    <w:p/>
-    <w:p/>
-    <w:p/>
-    <w:p>
-      <w:pPr>
-        <w:spacing w:after="120"/>
+    <w:p>
+      <w:pPr>
+        <w:spacing w:after="120" w:before="4200" w:line="360"/>
+        <w:ind w:firstLine="0"/>
         <w:jc w:val="center"/>
       </w:pPr>
       <w:r>
@@ -77,6 +60,8 @@
     </w:p>
     <w:p>
       <w:pPr>
+        <w:spacing w:after="0" w:before="0" w:line="360"/>
+        <w:ind w:firstLine="0"/>
         <w:jc w:val="center"/>
       </w:pPr>
       <w:r>

</xml_diff>